<commit_message>
Welt 6: Tracetabellen nur mit Variablen, Codestellen markiert; Endwerte-Markierung
Klausur Ladepark + EH, Nachschreib-EH, Probeklausur, AB 1 + LSG, Folien 4/11/15, Lehrerhinweise (P8),
Warm-up W6-06/08/12, Lab-Aufgaben und Boss. Konvention ergänzt: „// → Tabellenzeile (Endwerte)“ an der
schließenden Klammer der Schleife, wenn eine Endzeile verlangt ist; bei Struktogramm-Bildern Stellen im Text.

Co-Authored-By: Claude Opus 5.5 <noreply@anthropic.com>
Claude-Session: https://claude.ai/code/session_01CemoEYGRdCe5FszEBVFFUP
</commit_message>
<xml_diff>
--- a/materialien/Welt6_Endgegner/2_Arbeitsblaetter/AQ_W6_AB1_Korrektur_und_Fehlerjagd.docx
+++ b/materialien/Welt6_Endgegner/2_Arbeitsblaetter/AQ_W6_AB1_Korrektur_und_Fehlerjagd.docx
@@ -14893,7 +14893,7 @@
                 <w:sz w:val="18"/>
                 <w:szCs w:val="18"/>
               </w:rPr>
-              <w:t xml:space="preserve">vorgegebene Spalten, jede Wertänderung, Endwerte</w:t>
+              <w:t xml:space="preserve">nur Variablen, keine Bedingungen; eine Zeile an jeder markierten Stelle („// → Tabellenzeile“); vorgegebene Spalten, Endwerte</w:t>
             </w:r>
           </w:p>
         </w:tc>
@@ -21107,7 +21107,7 @@
           <w:sz w:val="22"/>
           <w:szCs w:val="22"/>
         </w:rPr>
-        <w:t xml:space="preserve">Die Reihung tage enthält die Lagertage der Pakete einer Station: tage = {3, 7, 7, 2, 9}. Lena dokumentiert den folgenden Ausschnitt mit einer Tracetabelle: eine Zeile vor der Schleife, eine Zeile je Schleifendurchlauf (Werte am Ende des Durchlaufs) und eine Zeile mit den Endwerten.</w:t>
+        <w:t xml:space="preserve">Die Reihung tage enthält die Lagertage der Pakete einer Station: tage = {3, 7, 7, 2, 9}. Lena dokumentiert den folgenden Ausschnitt mit einer Tracetabelle (nur Variablen): je eine Zeile an jeder mit „// → Tabellenzeile“ markierten Stelle – vor der Schleife (Startwerte), am Ende jedes Schleifendurchlaufs und nach der Schleife (Endwerte).</w:t>
       </w:r>
     </w:p>
     <w:tbl>
@@ -21168,19 +21168,14 @@
               </w:rPr>
               <w:t xml:space="preserve">int pos = -1;</w:t>
             </w:r>
-          </w:p>
-          <w:p>
-            <w:pPr>
-              <w:keepNext/>
-              <w:spacing w:after="0" w:before="0" w:line="225"/>
-            </w:pPr>
             <w:r>
               <w:rPr>
                 <w:rFonts w:ascii="Consolas" w:cs="Consolas" w:eastAsia="Consolas" w:hAnsi="Consolas"/>
                 <w:sz w:val="17"/>
                 <w:szCs w:val="17"/>
-              </w:rPr>
-              <w:t xml:space="preserve">for (int i = 0; i &lt; tage.length; i++) {</w:t>
+                <w:color w:val="5F7F5F"/>
+              </w:rPr>
+              <w:t xml:space="preserve">   // → Tabellenzeile (Startwerte)</w:t>
             </w:r>
           </w:p>
           <w:p>
@@ -21194,7 +21189,7 @@
                 <w:sz w:val="17"/>
                 <w:szCs w:val="17"/>
               </w:rPr>
-              <w:t xml:space="preserve">    if (tage[i] &gt; max) {</w:t>
+              <w:t xml:space="preserve">for (int i = 0; i &lt; tage.length; i++) {</w:t>
             </w:r>
           </w:p>
           <w:p>
@@ -21208,7 +21203,7 @@
                 <w:sz w:val="17"/>
                 <w:szCs w:val="17"/>
               </w:rPr>
-              <w:t xml:space="preserve">        max = tage[i];</w:t>
+              <w:t xml:space="preserve">    if (tage[i] &gt; max) {</w:t>
             </w:r>
           </w:p>
           <w:p>
@@ -21222,7 +21217,7 @@
                 <w:sz w:val="17"/>
                 <w:szCs w:val="17"/>
               </w:rPr>
-              <w:t xml:space="preserve">        pos = i;</w:t>
+              <w:t xml:space="preserve">        max = tage[i];</w:t>
             </w:r>
           </w:p>
           <w:p>
@@ -21236,7 +21231,7 @@
                 <w:sz w:val="17"/>
                 <w:szCs w:val="17"/>
               </w:rPr>
-              <w:t xml:space="preserve">    }</w:t>
+              <w:t xml:space="preserve">        pos = i;</w:t>
             </w:r>
           </w:p>
           <w:p>
@@ -21250,7 +21245,39 @@
                 <w:sz w:val="17"/>
                 <w:szCs w:val="17"/>
               </w:rPr>
+              <w:t xml:space="preserve">    }</w:t>
+            </w:r>
+            <w:r>
+              <w:rPr>
+                <w:rFonts w:ascii="Consolas" w:cs="Consolas" w:eastAsia="Consolas" w:hAnsi="Consolas"/>
+                <w:sz w:val="17"/>
+                <w:szCs w:val="17"/>
+                <w:color w:val="5F7F5F"/>
+              </w:rPr>
+              <w:t xml:space="preserve">   // → Tabellenzeile</w:t>
+            </w:r>
+          </w:p>
+          <w:p>
+            <w:pPr>
+              <w:keepNext/>
+              <w:spacing w:after="0" w:before="0" w:line="225"/>
+            </w:pPr>
+            <w:r>
+              <w:rPr>
+                <w:rFonts w:ascii="Consolas" w:cs="Consolas" w:eastAsia="Consolas" w:hAnsi="Consolas"/>
+                <w:sz w:val="17"/>
+                <w:szCs w:val="17"/>
+              </w:rPr>
               <w:t xml:space="preserve">}</w:t>
+            </w:r>
+            <w:r>
+              <w:rPr>
+                <w:rFonts w:ascii="Consolas" w:cs="Consolas" w:eastAsia="Consolas" w:hAnsi="Consolas"/>
+                <w:sz w:val="17"/>
+                <w:szCs w:val="17"/>
+                <w:color w:val="5F7F5F"/>
+              </w:rPr>
+              <w:t xml:space="preserve">   // → Tabellenzeile (Endwerte)</w:t>
             </w:r>
           </w:p>
         </w:tc>

</xml_diff>